<commit_message>
fix(word/table): stop flagging consumed 'data' key as unsupported
The inline 'data' shorthand (--prop data=A,B;1,2) is consumed up-front by
TryGetValue("data") to build the grid, but the later tblPr switch loop had no
skip/case for it, so its default branch pushed 'data' into LastAddUnsupportedProps
— a spurious unsupported_property WARNING on a key that worked. Add 'data' to the
same skip-list that already excludes rows/cols/colwidths (all consumed elsewhere).
Genuine typos still warn.

Also closes the word tables example: demonstrate the 'data' shorthand (Table 7),
taking table@docx coverage to 19/19. Fixed a pre-existing breakage in tables.sh
where the PPTX section used the rejected '/presentation/slides' parent instead of
'/', so tables.pptx never rebuilt. Regenerated docx/xlsx/pptx — all open in real
Office (officeshot) and validate clean. Table test suite green (1887).
</commit_message>
<xml_diff>
--- a/examples/word/tables.docx
+++ b/examples/word/tables.docx
@@ -2395,6 +2395,93 @@
           <w:p>
             <w:r>
               <w:t xml:space="preserve">row 2 col 2</w:t>
+            </w:r>
+          </w:p>
+        </w:tc>
+      </w:tr>
+    </w:tbl>
+    <w:tbl>
+      <w:tblPr>
+        <w:tblW w:w="8304" w:type="dxa"/>
+        <w:tblBorders>
+          <w:top w:val="single" w:color="808080" w:sz="4"/>
+          <w:left w:val="single" w:color="808080" w:sz="4"/>
+          <w:bottom w:val="single" w:color="808080" w:sz="4"/>
+          <w:right w:val="single" w:color="808080" w:sz="4"/>
+          <w:insideH w:val="single" w:color="808080" w:sz="4"/>
+          <w:insideV w:val="single" w:color="808080" w:sz="4"/>
+        </w:tblBorders>
+      </w:tblPr>
+      <w:tblGrid>
+        <w:gridCol w:w="2768"/>
+        <w:gridCol w:w="2768"/>
+        <w:gridCol w:w="2768"/>
+      </w:tblGrid>
+      <w:tr>
+        <w:tc>
+          <w:p>
+            <w:r>
+              <w:t xml:space="preserve">Region</w:t>
+            </w:r>
+          </w:p>
+        </w:tc>
+        <w:tc>
+          <w:p>
+            <w:r>
+              <w:t xml:space="preserve">Q1</w:t>
+            </w:r>
+          </w:p>
+        </w:tc>
+        <w:tc>
+          <w:p>
+            <w:r>
+              <w:t xml:space="preserve">Q2</w:t>
+            </w:r>
+          </w:p>
+        </w:tc>
+      </w:tr>
+      <w:tr>
+        <w:tc>
+          <w:p>
+            <w:r>
+              <w:t xml:space="preserve">North</w:t>
+            </w:r>
+          </w:p>
+        </w:tc>
+        <w:tc>
+          <w:p>
+            <w:r>
+              <w:t xml:space="preserve">120</w:t>
+            </w:r>
+          </w:p>
+        </w:tc>
+        <w:tc>
+          <w:p>
+            <w:r>
+              <w:t xml:space="preserve">150</w:t>
+            </w:r>
+          </w:p>
+        </w:tc>
+      </w:tr>
+      <w:tr>
+        <w:tc>
+          <w:p>
+            <w:r>
+              <w:t xml:space="preserve">South</w:t>
+            </w:r>
+          </w:p>
+        </w:tc>
+        <w:tc>
+          <w:p>
+            <w:r>
+              <w:t xml:space="preserve">90</w:t>
+            </w:r>
+          </w:p>
+        </w:tc>
+        <w:tc>
+          <w:p>
+            <w:r>
+              <w:t xml:space="preserve">110</w:t>
             </w:r>
           </w:p>
         </w:tc>

</xml_diff>